<commit_message>
SCRUM-32: Remove PII from tests and docs; tolerate BOM in sample product files
- Tests no longer embed member names or postal codes; the duplicate-member test reads the row from the file at runtime
- Member 360 PRD and data dictionary show "(PII - not shown)" as examples for first_name, last_name, postal_code
- Sample product header checks read with utf-8-sig so a byte-order mark doesn't break them
- Unit test case documents regenerated (130/130, 127/127); tasks 8.2 and 8.3 ticked; tools/.gitignore added

Co-Authored-By: Claude Opus 5.5 <noreply@anthropic.com>
</commit_message>
<xml_diff>
--- a/output/DP_Member_360/PRD_Member_360.docx
+++ b/output/DP_Member_360/PRD_Member_360.docx
@@ -3451,7 +3451,7 @@
               <w:rPr>
                 <w:sz w:val="17"/>
               </w:rPr>
-              <w:t>28202</w:t>
+              <w:t>28210</w:t>
             </w:r>
           </w:p>
         </w:tc>
@@ -5377,7 +5377,7 @@
               <w:rPr>
                 <w:sz w:val="17"/>
               </w:rPr>
-              <w:t>Avery</w:t>
+              <w:t>(PII – not shown)</w:t>
             </w:r>
           </w:p>
         </w:tc>
@@ -5476,7 +5476,7 @@
               <w:rPr>
                 <w:sz w:val="17"/>
               </w:rPr>
-              <w:t>Brooks</w:t>
+              <w:t>(PII – not shown)</w:t>
             </w:r>
           </w:p>
         </w:tc>
@@ -5872,7 +5872,7 @@
               <w:rPr>
                 <w:sz w:val="17"/>
               </w:rPr>
-              <w:t>28202</w:t>
+              <w:t>(PII – not shown)</w:t>
             </w:r>
           </w:p>
         </w:tc>

</xml_diff>